<commit_message>
docs: atualizar os documentos de estado e funcionalidades (v1.1.0)
Secção datada de 01/10/2026: domínio Ambiente (ISO 14001), Gestão Documental por norma,
Pesquisa global, correções, KYC multi-fornecedor (só develop) e pendentes.

Co-Authored-By: Claude Sonnet 5.5 <noreply@anthropic.com>
</commit_message>
<xml_diff>
--- a/2_FUNCIONALIDADES iComply App.docx
+++ b/2_FUNCIONALIDADES iComply App.docx
@@ -42775,6 +42775,233 @@
           <w:ilvl w:val="0"/>
           <w:numId w:val="1"/>
         </w:numPr>
+      </w:pPr>
+    </w:p>
+    <w:p>
+      <w:pPr>
+        <w:spacing w:after="80"/>
+        <w:ind w:left="360"/>
+        <w:rPr>
+          <w:rFonts w:ascii="Montserrat" w:hAnsi="Montserrat"/>
+          <w:sz w:val="20"/>
+          <w:szCs w:val="20"/>
+        </w:rPr>
+      </w:pPr>
+    </w:p>
+    <w:p>
+      <w:pPr>
+        <w:spacing w:after="80"/>
+        <w:ind w:left="360"/>
+        <w:rPr>
+          <w:rFonts w:ascii="Montserrat" w:hAnsi="Montserrat"/>
+          <w:sz w:val="20"/>
+          <w:szCs w:val="20"/>
+        </w:rPr>
+      </w:pPr>
+      <w:r>
+        <w:rPr>
+          <w:rFonts w:ascii="Montserrat" w:hAnsi="Montserrat" w:cs="Segoe UI Emoji"/>
+          <w:b/>
+          <w:bCs/>
+          <w:sz w:val="20"/>
+          <w:szCs w:val="20"/>
+        </w:rPr>
+        <w:t xml:space="preserve">🌿 Estado em 01/10/2026 — Domínio Ambiente (ISO 14001) e Gestão Documental: implementados (v1.1.0)</w:t>
+      </w:r>
+    </w:p>
+    <w:p>
+      <w:pPr>
+        <w:spacing w:after="80"/>
+        <w:ind w:left="360"/>
+        <w:rPr>
+          <w:rFonts w:ascii="Montserrat" w:hAnsi="Montserrat"/>
+          <w:sz w:val="20"/>
+          <w:szCs w:val="20"/>
+        </w:rPr>
+      </w:pPr>
+      <w:r>
+        <w:rPr>
+          <w:rFonts w:ascii="Montserrat" w:hAnsi="Montserrat" w:cs="Segoe UI Emoji"/>
+          <w:sz w:val="20"/>
+          <w:szCs w:val="20"/>
+        </w:rPr>
+        <w:t xml:space="preserve">Ambiente (ISO 14001) — separadores do módulo:</w:t>
+      </w:r>
+    </w:p>
+    <w:p>
+      <w:pPr>
+        <w:spacing w:after="80"/>
+        <w:ind w:left="720" w:hanging="360"/>
+        <w:rPr>
+          <w:rFonts w:ascii="Montserrat" w:hAnsi="Montserrat"/>
+          <w:sz w:val="20"/>
+          <w:szCs w:val="20"/>
+        </w:rPr>
+      </w:pPr>
+      <w:r>
+        <w:rPr>
+          <w:rFonts w:ascii="Montserrat" w:hAnsi="Montserrat" w:cs="Segoe UI Emoji"/>
+          <w:sz w:val="20"/>
+          <w:szCs w:val="20"/>
+        </w:rPr>
+        <w:t xml:space="preserve">• </w:t>
+      </w:r>
+      <w:r>
+        <w:rPr>
+          <w:rFonts w:ascii="Montserrat" w:hAnsi="Montserrat" w:cs="Segoe UI Emoji"/>
+          <w:sz w:val="20"/>
+          <w:szCs w:val="20"/>
+        </w:rPr>
+        <w:t xml:space="preserve">Requisitos ISO 14001: 27 requisitos das cláusulas 4 a 10 com estado, evidência, notas e score de conformidade.</w:t>
+      </w:r>
+    </w:p>
+    <w:p>
+      <w:pPr>
+        <w:spacing w:after="80"/>
+        <w:ind w:left="720" w:hanging="360"/>
+        <w:rPr>
+          <w:rFonts w:ascii="Montserrat" w:hAnsi="Montserrat"/>
+          <w:sz w:val="20"/>
+          <w:szCs w:val="20"/>
+        </w:rPr>
+      </w:pPr>
+      <w:r>
+        <w:rPr>
+          <w:rFonts w:ascii="Montserrat" w:hAnsi="Montserrat" w:cs="Segoe UI Emoji"/>
+          <w:sz w:val="20"/>
+          <w:szCs w:val="20"/>
+        </w:rPr>
+        <w:t xml:space="preserve">• </w:t>
+      </w:r>
+      <w:r>
+        <w:rPr>
+          <w:rFonts w:ascii="Montserrat" w:hAnsi="Montserrat" w:cs="Segoe UI Emoji"/>
+          <w:sz w:val="20"/>
+          <w:szCs w:val="20"/>
+        </w:rPr>
+        <w:t xml:space="preserve">Aspetos e Impactos: atividade, aspeto, impacto, condição (normal, anormal, emergência), fase do ciclo de vida, severidade e probabilidade (1 a 5), significância automática, controlos operacionais, responsável e data de revisão.</w:t>
+      </w:r>
+    </w:p>
+    <w:p>
+      <w:pPr>
+        <w:spacing w:after="80"/>
+        <w:ind w:left="720" w:hanging="360"/>
+        <w:rPr>
+          <w:rFonts w:ascii="Montserrat" w:hAnsi="Montserrat"/>
+          <w:sz w:val="20"/>
+          <w:szCs w:val="20"/>
+        </w:rPr>
+      </w:pPr>
+      <w:r>
+        <w:rPr>
+          <w:rFonts w:ascii="Montserrat" w:hAnsi="Montserrat" w:cs="Segoe UI Emoji"/>
+          <w:sz w:val="20"/>
+          <w:szCs w:val="20"/>
+        </w:rPr>
+        <w:t xml:space="preserve">• </w:t>
+      </w:r>
+      <w:r>
+        <w:rPr>
+          <w:rFonts w:ascii="Montserrat" w:hAnsi="Montserrat" w:cs="Segoe UI Emoji"/>
+          <w:sz w:val="20"/>
+          <w:szCs w:val="20"/>
+        </w:rPr>
+        <w:t xml:space="preserve">Objetivos e Metas: indicador, unidade, valor de partida, meta, valor atual, prazo, estado e ações; barra de progresso.</w:t>
+      </w:r>
+    </w:p>
+    <w:p>
+      <w:pPr>
+        <w:spacing w:after="80"/>
+        <w:ind w:left="720" w:hanging="360"/>
+        <w:rPr>
+          <w:rFonts w:ascii="Montserrat" w:hAnsi="Montserrat"/>
+          <w:sz w:val="20"/>
+          <w:szCs w:val="20"/>
+        </w:rPr>
+      </w:pPr>
+      <w:r>
+        <w:rPr>
+          <w:rFonts w:ascii="Montserrat" w:hAnsi="Montserrat" w:cs="Segoe UI Emoji"/>
+          <w:sz w:val="20"/>
+          <w:szCs w:val="20"/>
+        </w:rPr>
+        <w:t xml:space="preserve">• </w:t>
+      </w:r>
+      <w:r>
+        <w:rPr>
+          <w:rFonts w:ascii="Montserrat" w:hAnsi="Montserrat" w:cs="Segoe UI Emoji"/>
+          <w:sz w:val="20"/>
+          <w:szCs w:val="20"/>
+        </w:rPr>
+        <w:t xml:space="preserve">Requisitos Legais: fonte, categoria (resíduos, emissões, água, ruído, energia, químicos, licenças), o que é exigido, onde se aplica, cumprimento, última e próxima avaliação.</w:t>
+      </w:r>
+    </w:p>
+    <w:p>
+      <w:pPr>
+        <w:spacing w:after="80"/>
+        <w:ind w:left="360"/>
+        <w:rPr>
+          <w:rFonts w:ascii="Montserrat" w:hAnsi="Montserrat"/>
+          <w:sz w:val="20"/>
+          <w:szCs w:val="20"/>
+        </w:rPr>
+      </w:pPr>
+      <w:r>
+        <w:rPr>
+          <w:rFonts w:ascii="Montserrat" w:hAnsi="Montserrat" w:cs="Segoe UI Emoji"/>
+          <w:sz w:val="20"/>
+          <w:szCs w:val="20"/>
+        </w:rPr>
+        <w:t xml:space="preserve">Gestão Documental (todas as normas ISO): documentos por norma e cláusula, ficheiro real, versões, aprovação com separação de funções e acesso por módulo; anexos com versões nas Políticas.</w:t>
+      </w:r>
+    </w:p>
+    <w:p>
+      <w:pPr>
+        <w:spacing w:after="80"/>
+        <w:ind w:left="360"/>
+        <w:rPr>
+          <w:rFonts w:ascii="Montserrat" w:hAnsi="Montserrat"/>
+          <w:sz w:val="20"/>
+          <w:szCs w:val="20"/>
+        </w:rPr>
+      </w:pPr>
+      <w:r>
+        <w:rPr>
+          <w:rFonts w:ascii="Montserrat" w:hAnsi="Montserrat" w:cs="Segoe UI Emoji"/>
+          <w:sz w:val="20"/>
+          <w:szCs w:val="20"/>
+        </w:rPr>
+        <w:t xml:space="preserve">Pesquisa global: encontra qualquer palavra do conteúdo, ignora acentos, tolera erros e sugere assuntos relacionados, com resultados por prioridade.</w:t>
+      </w:r>
+    </w:p>
+    <w:p>
+      <w:pPr>
+        <w:spacing w:after="80"/>
+        <w:ind w:left="360"/>
+        <w:rPr>
+          <w:rFonts w:ascii="Montserrat" w:hAnsi="Montserrat"/>
+          <w:sz w:val="20"/>
+          <w:szCs w:val="20"/>
+        </w:rPr>
+      </w:pPr>
+      <w:r>
+        <w:rPr>
+          <w:rFonts w:ascii="Montserrat" w:hAnsi="Montserrat" w:cs="Segoe UI Emoji"/>
+          <w:sz w:val="20"/>
+          <w:szCs w:val="20"/>
+        </w:rPr>
+        <w:t xml:space="preserve">Ver também: README, ajuda da aplicação, changelog e docs/website (conteúdos do website, em português e inglês).</w:t>
+      </w:r>
+    </w:p>
+    <w:p>
+      <w:pPr>
+        <w:spacing w:after="80"/>
+        <w:ind w:left="360"/>
+        <w:rPr>
+          <w:rFonts w:ascii="Montserrat" w:hAnsi="Montserrat"/>
+          <w:sz w:val="20"/>
+          <w:szCs w:val="20"/>
+        </w:rPr>
       </w:pPr>
     </w:p>
     <w:sectPr>

</xml_diff>

<commit_message>
refactor(esg): ISO 14001 passa a viver dentro do domínio ESG & Sustentabilidade
A análise de desenvolvimento (e o website) já previam a ISO 14001 no domínio ESG; o módulo
tinha sido apresentado como domínio novo. Agora: item no grupo ESG do menu, ligações
ESG <-> ISO 14001, textos de ajuda/changelog/README/pesquisa em conformidade, conteúdos do
website reescritos como atualização da página ESG existente (sem domínio duplicado) e
documentos Word corrigidos. O módulo e as permissões (environment) não mudam.

Co-Authored-By: Claude Sonnet 5.5 <noreply@anthropic.com>
</commit_message>
<xml_diff>
--- a/2_FUNCIONALIDADES iComply App.docx
+++ b/2_FUNCIONALIDADES iComply App.docx
@@ -42806,7 +42806,7 @@
           <w:sz w:val="20"/>
           <w:szCs w:val="20"/>
         </w:rPr>
-        <w:t xml:space="preserve">🌿 Estado em 01/10/2026 — Domínio Ambiente (ISO 14001) e Gestão Documental: implementados (v1.1.0)</w:t>
+        <w:t xml:space="preserve">🌿 Estado em 01/10/2026 — ISO 14001 (domínio ESG &amp; Sustentabilidade) e Gestão Documental: implementadas (v1.1.0)</w:t>
       </w:r>
     </w:p>
     <w:p>
@@ -42825,7 +42825,7 @@
           <w:sz w:val="20"/>
           <w:szCs w:val="20"/>
         </w:rPr>
-        <w:t xml:space="preserve">Ambiente (ISO 14001) — separadores do módulo:</w:t>
+        <w:t xml:space="preserve">ISO 14001 — Gestão Ambiental (dentro do domínio ESG &amp; Sustentabilidade; o ESG continua a tratar do reporte CSRD/ESRS e GRI) — separadores do módulo:</w:t>
       </w:r>
     </w:p>
     <w:p>

</xml_diff>

<commit_message>
feat(site): catalogo publico + leads do site, docs e conteudos comerciais
- GET /public/catalog: manifesto do produto (dominios, normas disponivel/parcial/roadmap), fonte unica catalog.data.ts, com testes que o mantem honesto
- POST /public/leads: demonstracao, contacto, sugestao de funcionalidade, novidades (consentimento, honeypot, limite por IP, notificacao opcional); tabela product_leads (aditiva)
- Backoffice: pagina Leads do site (super-admin)
- Ajuda, changelog, documentacao da API, README e documentos Word atualizados
- docs/website: conteudos comerciais das novas normas, INTEGRATION.md, registo de lacunas site vs app

Co-Authored-By: Claude Sonnet 5.5 <noreply@anthropic.com>
</commit_message>
<xml_diff>
--- a/2_FUNCIONALIDADES iComply App.docx
+++ b/2_FUNCIONALIDADES iComply App.docx
@@ -43003,6 +43003,390 @@
           <w:szCs w:val="20"/>
         </w:rPr>
       </w:pPr>
+    </w:p>
+    <w:p>
+      <w:pPr>
+        <w:spacing w:after="80"/>
+        <w:ind w:left="360"/>
+        <w:rPr>
+          <w:rFonts w:ascii="Montserrat" w:hAnsi="Montserrat"/>
+          <w:sz w:val="20"/>
+          <w:szCs w:val="20"/>
+        </w:rPr>
+      </w:pPr>
+    </w:p>
+    <w:p>
+      <w:pPr>
+        <w:spacing w:after="80"/>
+        <w:ind w:left="360"/>
+        <w:rPr>
+          <w:rFonts w:ascii="Montserrat" w:hAnsi="Montserrat"/>
+          <w:sz w:val="20"/>
+          <w:szCs w:val="20"/>
+        </w:rPr>
+      </w:pPr>
+      <w:r>
+        <w:rPr>
+          <w:rFonts w:ascii="Montserrat" w:hAnsi="Montserrat" w:cs="Segoe UI Emoji"/>
+          <w:b/>
+          <w:bCs/>
+          <w:sz w:val="20"/>
+          <w:szCs w:val="20"/>
+        </w:rPr>
+        <w:t xml:space="preserve">🔗 Atualização 01/10/2026 (2) — Novas normas, ligação ESG e ligação site ↔ aplicação</w:t>
+      </w:r>
+    </w:p>
+    <w:p>
+      <w:pPr>
+        <w:spacing w:after="80"/>
+        <w:ind w:left="360"/>
+        <w:rPr>
+          <w:rFonts w:ascii="Montserrat" w:hAnsi="Montserrat"/>
+          <w:sz w:val="20"/>
+          <w:szCs w:val="20"/>
+        </w:rPr>
+      </w:pPr>
+      <w:r>
+        <w:rPr>
+          <w:rFonts w:ascii="Montserrat" w:hAnsi="Montserrat" w:cs="Segoe UI Emoji"/>
+          <w:b/>
+          <w:bCs/>
+          <w:sz w:val="20"/>
+          <w:szCs w:val="20"/>
+        </w:rPr>
+        <w:t xml:space="preserve">Novas normas (motor genérico de checklists)</w:t>
+      </w:r>
+    </w:p>
+    <w:p>
+      <w:pPr>
+        <w:spacing w:after="80"/>
+        <w:ind w:left="720" w:hanging="360"/>
+        <w:rPr>
+          <w:rFonts w:ascii="Montserrat" w:hAnsi="Montserrat"/>
+          <w:sz w:val="20"/>
+          <w:szCs w:val="20"/>
+        </w:rPr>
+      </w:pPr>
+      <w:r>
+        <w:rPr>
+          <w:rFonts w:ascii="Montserrat" w:hAnsi="Montserrat" w:cs="Segoe UI Emoji"/>
+          <w:sz w:val="20"/>
+          <w:szCs w:val="20"/>
+        </w:rPr>
+        <w:t xml:space="preserve">• </w:t>
+      </w:r>
+      <w:r>
+        <w:rPr>
+          <w:rFonts w:ascii="Montserrat" w:hAnsi="Montserrat" w:cs="Segoe UI Emoji"/>
+          <w:sz w:val="20"/>
+          <w:szCs w:val="20"/>
+        </w:rPr>
+        <w:t xml:space="preserve">ISO 22000 (segurança alimentar) e ISO 13485 (dispositivos médicos), no domínio Qualidade e Operações.</w:t>
+      </w:r>
+    </w:p>
+    <w:p>
+      <w:pPr>
+        <w:spacing w:after="80"/>
+        <w:ind w:left="720" w:hanging="360"/>
+        <w:rPr>
+          <w:rFonts w:ascii="Montserrat" w:hAnsi="Montserrat"/>
+          <w:sz w:val="20"/>
+          <w:szCs w:val="20"/>
+        </w:rPr>
+      </w:pPr>
+      <w:r>
+        <w:rPr>
+          <w:rFonts w:ascii="Montserrat" w:hAnsi="Montserrat" w:cs="Segoe UI Emoji"/>
+          <w:sz w:val="20"/>
+          <w:szCs w:val="20"/>
+        </w:rPr>
+        <w:t xml:space="preserve">• </w:t>
+      </w:r>
+      <w:r>
+        <w:rPr>
+          <w:rFonts w:ascii="Montserrat" w:hAnsi="Montserrat" w:cs="Segoe UI Emoji"/>
+          <w:sz w:val="20"/>
+          <w:szCs w:val="20"/>
+        </w:rPr>
+        <w:t xml:space="preserve">ISO/IEC 20000-1 (gestão de serviços de TI), no domínio Segurança.</w:t>
+      </w:r>
+    </w:p>
+    <w:p>
+      <w:pPr>
+        <w:spacing w:after="80"/>
+        <w:ind w:left="720" w:hanging="360"/>
+        <w:rPr>
+          <w:rFonts w:ascii="Montserrat" w:hAnsi="Montserrat"/>
+          <w:sz w:val="20"/>
+          <w:szCs w:val="20"/>
+        </w:rPr>
+      </w:pPr>
+      <w:r>
+        <w:rPr>
+          <w:rFonts w:ascii="Montserrat" w:hAnsi="Montserrat" w:cs="Segoe UI Emoji"/>
+          <w:sz w:val="20"/>
+          <w:szCs w:val="20"/>
+        </w:rPr>
+        <w:t xml:space="preserve">• </w:t>
+      </w:r>
+      <w:r>
+        <w:rPr>
+          <w:rFonts w:ascii="Montserrat" w:hAnsi="Montserrat" w:cs="Segoe UI Emoji"/>
+          <w:sz w:val="20"/>
+          <w:szCs w:val="20"/>
+        </w:rPr>
+        <w:t xml:space="preserve">ISO/IEC 27018 (proteção de dados pessoais na cloud), no domínio Privacidade.</w:t>
+      </w:r>
+    </w:p>
+    <w:p>
+      <w:pPr>
+        <w:spacing w:after="80"/>
+        <w:ind w:left="720" w:hanging="360"/>
+        <w:rPr>
+          <w:rFonts w:ascii="Montserrat" w:hAnsi="Montserrat"/>
+          <w:sz w:val="20"/>
+          <w:szCs w:val="20"/>
+        </w:rPr>
+      </w:pPr>
+      <w:r>
+        <w:rPr>
+          <w:rFonts w:ascii="Montserrat" w:hAnsi="Montserrat" w:cs="Segoe UI Emoji"/>
+          <w:sz w:val="20"/>
+          <w:szCs w:val="20"/>
+        </w:rPr>
+        <w:t xml:space="preserve">• </w:t>
+      </w:r>
+      <w:r>
+        <w:rPr>
+          <w:rFonts w:ascii="Montserrat" w:hAnsi="Montserrat" w:cs="Segoe UI Emoji"/>
+          <w:sz w:val="20"/>
+          <w:szCs w:val="20"/>
+        </w:rPr>
+        <w:t xml:space="preserve">ISO/IEC 27036 (segurança na cadeia de fornecimento), no domínio Terceiros.</w:t>
+      </w:r>
+    </w:p>
+    <w:p>
+      <w:pPr>
+        <w:spacing w:after="80"/>
+        <w:ind w:left="720" w:hanging="360"/>
+        <w:rPr>
+          <w:rFonts w:ascii="Montserrat" w:hAnsi="Montserrat"/>
+          <w:sz w:val="20"/>
+          <w:szCs w:val="20"/>
+        </w:rPr>
+      </w:pPr>
+      <w:r>
+        <w:rPr>
+          <w:rFonts w:ascii="Montserrat" w:hAnsi="Montserrat" w:cs="Segoe UI Emoji"/>
+          <w:sz w:val="20"/>
+          <w:szCs w:val="20"/>
+        </w:rPr>
+        <w:t xml:space="preserve">• </w:t>
+      </w:r>
+      <w:r>
+        <w:rPr>
+          <w:rFonts w:ascii="Montserrat" w:hAnsi="Montserrat" w:cs="Segoe UI Emoji"/>
+          <w:sz w:val="20"/>
+          <w:szCs w:val="20"/>
+        </w:rPr>
+        <w:t xml:space="preserve">NIST AI RMF e ISO/IEC 23894 (risco de IA), no domínio Governança de IA.</w:t>
+      </w:r>
+    </w:p>
+    <w:p>
+      <w:pPr>
+        <w:spacing w:after="80"/>
+        <w:ind w:left="360"/>
+        <w:rPr>
+          <w:rFonts w:ascii="Montserrat" w:hAnsi="Montserrat"/>
+          <w:sz w:val="20"/>
+          <w:szCs w:val="20"/>
+        </w:rPr>
+      </w:pPr>
+      <w:r>
+        <w:rPr>
+          <w:rFonts w:ascii="Montserrat" w:hAnsi="Montserrat" w:cs="Segoe UI Emoji"/>
+          <w:sz w:val="20"/>
+          <w:szCs w:val="20"/>
+        </w:rPr>
+        <w:t xml:space="preserve">Cada norma: checklist completa criada na primeira visita, estado/evidência/notas/responsável/prazo por requisito, score, documentos na Gestão Documental e resultados na pesquisa global. Permissões: seguem o módulo do domínio (perfis só de leitura veem, não alteram).</w:t>
+      </w:r>
+    </w:p>
+    <w:p>
+      <w:pPr>
+        <w:spacing w:after="80"/>
+        <w:ind w:left="360"/>
+        <w:rPr>
+          <w:rFonts w:ascii="Montserrat" w:hAnsi="Montserrat"/>
+          <w:sz w:val="20"/>
+          <w:szCs w:val="20"/>
+        </w:rPr>
+      </w:pPr>
+      <w:r>
+        <w:rPr>
+          <w:rFonts w:ascii="Montserrat" w:hAnsi="Montserrat" w:cs="Segoe UI Emoji"/>
+          <w:b/>
+          <w:bCs/>
+          <w:sz w:val="20"/>
+          <w:szCs w:val="20"/>
+        </w:rPr>
+        <w:t xml:space="preserve">ESG e ISO 14001</w:t>
+      </w:r>
+    </w:p>
+    <w:p>
+      <w:pPr>
+        <w:spacing w:after="80"/>
+        <w:ind w:left="720" w:hanging="360"/>
+        <w:rPr>
+          <w:rFonts w:ascii="Montserrat" w:hAnsi="Montserrat"/>
+          <w:sz w:val="20"/>
+          <w:szCs w:val="20"/>
+        </w:rPr>
+      </w:pPr>
+      <w:r>
+        <w:rPr>
+          <w:rFonts w:ascii="Montserrat" w:hAnsi="Montserrat" w:cs="Segoe UI Emoji"/>
+          <w:sz w:val="20"/>
+          <w:szCs w:val="20"/>
+        </w:rPr>
+        <w:t xml:space="preserve">• </w:t>
+      </w:r>
+      <w:r>
+        <w:rPr>
+          <w:rFonts w:ascii="Montserrat" w:hAnsi="Montserrat" w:cs="Segoe UI Emoji"/>
+          <w:sz w:val="20"/>
+          <w:szCs w:val="20"/>
+        </w:rPr>
+        <w:t xml:space="preserve">Objetivos ambientais ligados às métricas ESG (CSRD/GRI): o valor atual é o da métrica.</w:t>
+      </w:r>
+    </w:p>
+    <w:p>
+      <w:pPr>
+        <w:spacing w:after="80"/>
+        <w:ind w:left="720" w:hanging="360"/>
+        <w:rPr>
+          <w:rFonts w:ascii="Montserrat" w:hAnsi="Montserrat"/>
+          <w:sz w:val="20"/>
+          <w:szCs w:val="20"/>
+        </w:rPr>
+      </w:pPr>
+      <w:r>
+        <w:rPr>
+          <w:rFonts w:ascii="Montserrat" w:hAnsi="Montserrat" w:cs="Segoe UI Emoji"/>
+          <w:sz w:val="20"/>
+          <w:szCs w:val="20"/>
+        </w:rPr>
+        <w:t xml:space="preserve">• </w:t>
+      </w:r>
+      <w:r>
+        <w:rPr>
+          <w:rFonts w:ascii="Montserrat" w:hAnsi="Montserrat" w:cs="Segoe UI Emoji"/>
+          <w:sz w:val="20"/>
+          <w:szCs w:val="20"/>
+        </w:rPr>
+        <w:t xml:space="preserve">Correção da inicialização das métricas CSRD/GRI.</w:t>
+      </w:r>
+    </w:p>
+    <w:p>
+      <w:pPr>
+        <w:spacing w:after="80"/>
+        <w:ind w:left="360"/>
+        <w:rPr>
+          <w:rFonts w:ascii="Montserrat" w:hAnsi="Montserrat"/>
+          <w:sz w:val="20"/>
+          <w:szCs w:val="20"/>
+        </w:rPr>
+      </w:pPr>
+      <w:r>
+        <w:rPr>
+          <w:rFonts w:ascii="Montserrat" w:hAnsi="Montserrat" w:cs="Segoe UI Emoji"/>
+          <w:b/>
+          <w:bCs/>
+          <w:sz w:val="20"/>
+          <w:szCs w:val="20"/>
+        </w:rPr>
+        <w:t xml:space="preserve">Site e aplicação</w:t>
+      </w:r>
+    </w:p>
+    <w:p>
+      <w:pPr>
+        <w:spacing w:after="80"/>
+        <w:ind w:left="720" w:hanging="360"/>
+        <w:rPr>
+          <w:rFonts w:ascii="Montserrat" w:hAnsi="Montserrat"/>
+          <w:sz w:val="20"/>
+          <w:szCs w:val="20"/>
+        </w:rPr>
+      </w:pPr>
+      <w:r>
+        <w:rPr>
+          <w:rFonts w:ascii="Montserrat" w:hAnsi="Montserrat" w:cs="Segoe UI Emoji"/>
+          <w:sz w:val="20"/>
+          <w:szCs w:val="20"/>
+        </w:rPr>
+        <w:t xml:space="preserve">• </w:t>
+      </w:r>
+      <w:r>
+        <w:rPr>
+          <w:rFonts w:ascii="Montserrat" w:hAnsi="Montserrat" w:cs="Segoe UI Emoji"/>
+          <w:sz w:val="20"/>
+          <w:szCs w:val="20"/>
+        </w:rPr>
+        <w:t xml:space="preserve">Catálogo público (GET /public/catalog): o site mostra o que a aplicação oferece, com estado disponível / parcial / roadmap.</w:t>
+      </w:r>
+    </w:p>
+    <w:p>
+      <w:pPr>
+        <w:spacing w:after="80"/>
+        <w:ind w:left="720" w:hanging="360"/>
+        <w:rPr>
+          <w:rFonts w:ascii="Montserrat" w:hAnsi="Montserrat"/>
+          <w:sz w:val="20"/>
+          <w:szCs w:val="20"/>
+        </w:rPr>
+      </w:pPr>
+      <w:r>
+        <w:rPr>
+          <w:rFonts w:ascii="Montserrat" w:hAnsi="Montserrat" w:cs="Segoe UI Emoji"/>
+          <w:sz w:val="20"/>
+          <w:szCs w:val="20"/>
+        </w:rPr>
+        <w:t xml:space="preserve">• </w:t>
+      </w:r>
+      <w:r>
+        <w:rPr>
+          <w:rFonts w:ascii="Montserrat" w:hAnsi="Montserrat" w:cs="Segoe UI Emoji"/>
+          <w:sz w:val="20"/>
+          <w:szCs w:val="20"/>
+        </w:rPr>
+        <w:t xml:space="preserve">Leads do site (POST /public/leads): pedidos de demonstração, contactos, sugestões de funcionalidades e novidades chegam à aplicação (backoffice, “Leads do site”), com consentimento RGPD, proteção anti-bot e limite de envios.</w:t>
+      </w:r>
+    </w:p>
+    <w:p>
+      <w:pPr>
+        <w:spacing w:after="80"/>
+        <w:ind w:left="720" w:hanging="360"/>
+        <w:rPr>
+          <w:rFonts w:ascii="Montserrat" w:hAnsi="Montserrat"/>
+          <w:sz w:val="20"/>
+          <w:szCs w:val="20"/>
+        </w:rPr>
+      </w:pPr>
+      <w:r>
+        <w:rPr>
+          <w:rFonts w:ascii="Montserrat" w:hAnsi="Montserrat" w:cs="Segoe UI Emoji"/>
+          <w:sz w:val="20"/>
+          <w:szCs w:val="20"/>
+        </w:rPr>
+        <w:t xml:space="preserve">• </w:t>
+      </w:r>
+      <w:r>
+        <w:rPr>
+          <w:rFonts w:ascii="Montserrat" w:hAnsi="Montserrat" w:cs="Segoe UI Emoji"/>
+          <w:sz w:val="20"/>
+          <w:szCs w:val="20"/>
+        </w:rPr>
+        <w:t xml:space="preserve">Regra de manutenção: cada módulo, domínio ou norma novos atualizam o catálogo, a ajuda, o changelog, a documentação da API, o índice da pesquisa, o README, estes documentos e os conteúdos do website.</w:t>
+      </w:r>
     </w:p>
     <w:sectPr>
       <w:pgSz w:w="11906" w:h="16838"/>

</xml_diff>

<commit_message>
feat(documents): documentos partilhados entre normas e atalhos nos modulos
- QualityDocument.alsoStandards (coluna aditiva): o mesmo documento serve varias normas, com um so ficheiro, versoes e aprovacao
- Ler: acesso a qualquer norma do documento; alterar/aprovar/mover/eliminar: escrita na norma principal; partilhar exige escrita na norma de destino
- Listas por norma incluem os partilhados; canWrite por documento; pesquisa respeita o acesso e abre a norma que o leitor pode ver
- UI: Aplica-se tambem a (novo documento), icone Partilhar, etiquetas Partilhado de / Tambem
- Atalho Documentos da norma nas paginas ISO 27001, 45001, 22301, 37001, 27701 e 42001
- Ajuda, changelog, API, README, catalogo, conteudos do site e Word atualizados

Co-Authored-By: Claude Sonnet 5.5 <noreply@anthropic.com>
</commit_message>
<xml_diff>
--- a/2_FUNCIONALIDADES iComply App.docx
+++ b/2_FUNCIONALIDADES iComply App.docx
@@ -43386,6 +43386,146 @@
           <w:szCs w:val="20"/>
         </w:rPr>
         <w:t xml:space="preserve">Regra de manutenção: cada módulo, domínio ou norma novos atualizam o catálogo, a ajuda, o changelog, a documentação da API, o índice da pesquisa, o README, estes documentos e os conteúdos do website.</w:t>
+      </w:r>
+    </w:p>
+    <w:p>
+      <w:pPr>
+        <w:spacing w:after="80"/>
+        <w:ind w:left="360"/>
+        <w:rPr>
+          <w:rFonts w:ascii="Montserrat" w:hAnsi="Montserrat"/>
+          <w:sz w:val="20"/>
+          <w:szCs w:val="20"/>
+        </w:rPr>
+      </w:pPr>
+    </w:p>
+    <w:p>
+      <w:pPr>
+        <w:spacing w:after="80"/>
+        <w:ind w:left="360"/>
+        <w:rPr>
+          <w:rFonts w:ascii="Montserrat" w:hAnsi="Montserrat"/>
+          <w:sz w:val="20"/>
+          <w:szCs w:val="20"/>
+        </w:rPr>
+      </w:pPr>
+      <w:r>
+        <w:rPr>
+          <w:rFonts w:ascii="Montserrat" w:hAnsi="Montserrat" w:cs="Segoe UI Emoji"/>
+          <w:b/>
+          <w:bCs/>
+          <w:sz w:val="20"/>
+          <w:szCs w:val="20"/>
+        </w:rPr>
+        <w:t xml:space="preserve">📎 Atualização 02/10/2026 — Gestão Documental: documentos partilhados entre normas e atalhos</w:t>
+      </w:r>
+    </w:p>
+    <w:p>
+      <w:pPr>
+        <w:spacing w:after="80"/>
+        <w:ind w:left="720" w:hanging="360"/>
+        <w:rPr>
+          <w:rFonts w:ascii="Montserrat" w:hAnsi="Montserrat"/>
+          <w:sz w:val="20"/>
+          <w:szCs w:val="20"/>
+        </w:rPr>
+      </w:pPr>
+      <w:r>
+        <w:rPr>
+          <w:rFonts w:ascii="Montserrat" w:hAnsi="Montserrat" w:cs="Segoe UI Emoji"/>
+          <w:sz w:val="20"/>
+          <w:szCs w:val="20"/>
+        </w:rPr>
+        <w:t xml:space="preserve">• </w:t>
+      </w:r>
+      <w:r>
+        <w:rPr>
+          <w:rFonts w:ascii="Montserrat" w:hAnsi="Montserrat" w:cs="Segoe UI Emoji"/>
+          <w:sz w:val="20"/>
+          <w:szCs w:val="20"/>
+        </w:rPr>
+        <w:t xml:space="preserve">Um documento pode agora servir várias normas (campo “Aplica-se também a”): um só ficheiro, um só histórico de versões e uma só aprovação, listado em cada norma a que se aplica (nas outras com a etiqueta “Partilhado de…”). Exemplo: o procedimento de controlo de documentos usado na ISO 9001, na ISO 14001 e na ISO 45001.</w:t>
+      </w:r>
+    </w:p>
+    <w:p>
+      <w:pPr>
+        <w:spacing w:after="80"/>
+        <w:ind w:left="720" w:hanging="360"/>
+        <w:rPr>
+          <w:rFonts w:ascii="Montserrat" w:hAnsi="Montserrat"/>
+          <w:sz w:val="20"/>
+          <w:szCs w:val="20"/>
+        </w:rPr>
+      </w:pPr>
+      <w:r>
+        <w:rPr>
+          <w:rFonts w:ascii="Montserrat" w:hAnsi="Montserrat" w:cs="Segoe UI Emoji"/>
+          <w:sz w:val="20"/>
+          <w:szCs w:val="20"/>
+        </w:rPr>
+        <w:t xml:space="preserve">• </w:t>
+      </w:r>
+      <w:r>
+        <w:rPr>
+          <w:rFonts w:ascii="Montserrat" w:hAnsi="Montserrat" w:cs="Segoe UI Emoji"/>
+          <w:sz w:val="20"/>
+          <w:szCs w:val="20"/>
+        </w:rPr>
+        <w:t xml:space="preserve">Regras de acesso: quem lê qualquer uma das normas vê e descarrega o documento; só a equipa da norma principal o altera, aprova, move ou elimina; para partilhar com uma norma é preciso permissão de escrita nela. A pesquisa respeita as mesmas regras e abre a lista da norma a que o utilizador tem acesso.</w:t>
+      </w:r>
+    </w:p>
+    <w:p>
+      <w:pPr>
+        <w:spacing w:after="80"/>
+        <w:ind w:left="720" w:hanging="360"/>
+        <w:rPr>
+          <w:rFonts w:ascii="Montserrat" w:hAnsi="Montserrat"/>
+          <w:sz w:val="20"/>
+          <w:szCs w:val="20"/>
+        </w:rPr>
+      </w:pPr>
+      <w:r>
+        <w:rPr>
+          <w:rFonts w:ascii="Montserrat" w:hAnsi="Montserrat" w:cs="Segoe UI Emoji"/>
+          <w:sz w:val="20"/>
+          <w:szCs w:val="20"/>
+        </w:rPr>
+        <w:t xml:space="preserve">• </w:t>
+      </w:r>
+      <w:r>
+        <w:rPr>
+          <w:rFonts w:ascii="Montserrat" w:hAnsi="Montserrat" w:cs="Segoe UI Emoji"/>
+          <w:sz w:val="20"/>
+          <w:szCs w:val="20"/>
+        </w:rPr>
+        <w:t xml:space="preserve">As páginas de ISO 27001, ISO 45001, ISO 22301, ISO 37001, ISO 27701 e ISO 42001 passam a ter um atalho para os documentos da respetiva norma (já existiam em ISO 14001, Qualidade, Políticas e nas checklists das normas novas).</w:t>
+      </w:r>
+    </w:p>
+    <w:p>
+      <w:pPr>
+        <w:spacing w:after="80"/>
+        <w:ind w:left="720" w:hanging="360"/>
+        <w:rPr>
+          <w:rFonts w:ascii="Montserrat" w:hAnsi="Montserrat"/>
+          <w:sz w:val="20"/>
+          <w:szCs w:val="20"/>
+        </w:rPr>
+      </w:pPr>
+      <w:r>
+        <w:rPr>
+          <w:rFonts w:ascii="Montserrat" w:hAnsi="Montserrat" w:cs="Segoe UI Emoji"/>
+          <w:sz w:val="20"/>
+          <w:szCs w:val="20"/>
+        </w:rPr>
+        <w:t xml:space="preserve">• </w:t>
+      </w:r>
+      <w:r>
+        <w:rPr>
+          <w:rFonts w:ascii="Montserrat" w:hAnsi="Montserrat" w:cs="Segoe UI Emoji"/>
+          <w:sz w:val="20"/>
+          <w:szCs w:val="20"/>
+        </w:rPr>
+        <w:t xml:space="preserve">Base de dados: coluna nova aditiva alsoStandards em quality_documents. Testes: unitários de partilha e acesso; ponta a ponta em e2e-shared-docs.</w:t>
       </w:r>
     </w:p>
     <w:sectPr>

</xml_diff>

<commit_message>
feat(support): avisos por email de tickets e perfil Agente de Suporte
- Novo ticket e resposta do cliente avisam a equipa (SUPPORT_NOTIFY_EMAIL, senao agentes SUPPORT, senao super-admins da plataforma) com resumo e ligacao direta; o autor e avisado quando o suporte responde (notas internas nunca) e quando resolve
- Novo perfil SUPPORT (valor aditivo no enum): so atende tickets, sem acesso a modulos; so super-admin o cria; menu de suporte com contagem por responder
- Seguranca: equipa de suporte = SUPPORT/SUPER_ADMIN da organizacao da plataforma (um super-admin numa organizacao de cliente deixa de ver todos os tickets); atribuicao so a equipa; anexos seguem a visibilidade do ticket (antes qualquer um anexava a tickets alheios e o suporte nao descarregava anexos de clientes)
- Ajuda, changelog, API, README, .env.example e Word atualizados; 13 testes novos

Co-Authored-By: Claude Sonnet 5.5 <noreply@anthropic.com>
</commit_message>
<xml_diff>
--- a/2_FUNCIONALIDADES iComply App.docx
+++ b/2_FUNCIONALIDADES iComply App.docx
@@ -43666,6 +43666,146 @@
           <w:szCs w:val="20"/>
         </w:rPr>
         <w:t xml:space="preserve">Base de dados: colunas novas e aditivas em identity_verifications.</w:t>
+      </w:r>
+    </w:p>
+    <w:p>
+      <w:pPr>
+        <w:spacing w:after="80"/>
+        <w:ind w:left="360"/>
+        <w:rPr>
+          <w:rFonts w:ascii="Montserrat" w:hAnsi="Montserrat"/>
+          <w:sz w:val="20"/>
+          <w:szCs w:val="20"/>
+        </w:rPr>
+      </w:pPr>
+    </w:p>
+    <w:p>
+      <w:pPr>
+        <w:spacing w:after="80"/>
+        <w:ind w:left="360"/>
+        <w:rPr>
+          <w:rFonts w:ascii="Montserrat" w:hAnsi="Montserrat"/>
+          <w:sz w:val="20"/>
+          <w:szCs w:val="20"/>
+        </w:rPr>
+      </w:pPr>
+      <w:r>
+        <w:rPr>
+          <w:rFonts w:ascii="Montserrat" w:hAnsi="Montserrat" w:cs="Segoe UI Emoji"/>
+          <w:b/>
+          <w:bCs/>
+          <w:sz w:val="20"/>
+          <w:szCs w:val="20"/>
+        </w:rPr>
+        <w:t xml:space="preserve">🛟 Atualização 02/10/2026 (2) — Suporte: avisos de novos tickets e perfil Agente de Suporte</w:t>
+      </w:r>
+    </w:p>
+    <w:p>
+      <w:pPr>
+        <w:spacing w:after="80"/>
+        <w:ind w:left="720" w:hanging="360"/>
+        <w:rPr>
+          <w:rFonts w:ascii="Montserrat" w:hAnsi="Montserrat"/>
+          <w:sz w:val="20"/>
+          <w:szCs w:val="20"/>
+        </w:rPr>
+      </w:pPr>
+      <w:r>
+        <w:rPr>
+          <w:rFonts w:ascii="Montserrat" w:hAnsi="Montserrat" w:cs="Segoe UI Emoji"/>
+          <w:sz w:val="20"/>
+          <w:szCs w:val="20"/>
+        </w:rPr>
+        <w:t xml:space="preserve">• </w:t>
+      </w:r>
+      <w:r>
+        <w:rPr>
+          <w:rFonts w:ascii="Montserrat" w:hAnsi="Montserrat" w:cs="Segoe UI Emoji"/>
+          <w:sz w:val="20"/>
+          <w:szCs w:val="20"/>
+        </w:rPr>
+        <w:t xml:space="preserve">Avisos por email: um ticket novo e cada resposta do cliente enviam à equipa de suporte um email com o resumo (assunto, organização, autor, categoria, prioridade, início do texto) e um botão para abrir e responder. O autor é avisado quando o suporte responde (as notas internas nunca são enviadas) e quando o ticket é resolvido. Destinatários: SUPPORT_NOTIFY_EMAIL (caixa partilhada), senão os utilizadores com perfil Agente de Suporte, senão os super-administradores da plataforma. O menu mostra o número de tickets por responder.</w:t>
+      </w:r>
+    </w:p>
+    <w:p>
+      <w:pPr>
+        <w:spacing w:after="80"/>
+        <w:ind w:left="720" w:hanging="360"/>
+        <w:rPr>
+          <w:rFonts w:ascii="Montserrat" w:hAnsi="Montserrat"/>
+          <w:sz w:val="20"/>
+          <w:szCs w:val="20"/>
+        </w:rPr>
+      </w:pPr>
+      <w:r>
+        <w:rPr>
+          <w:rFonts w:ascii="Montserrat" w:hAnsi="Montserrat" w:cs="Segoe UI Emoji"/>
+          <w:sz w:val="20"/>
+          <w:szCs w:val="20"/>
+        </w:rPr>
+        <w:t xml:space="preserve">• </w:t>
+      </w:r>
+      <w:r>
+        <w:rPr>
+          <w:rFonts w:ascii="Montserrat" w:hAnsi="Montserrat" w:cs="Segoe UI Emoji"/>
+          <w:sz w:val="20"/>
+          <w:szCs w:val="20"/>
+        </w:rPr>
+        <w:t xml:space="preserve">Novo perfil SUPPORT (Agente de Suporte): só atende tickets (vê todos, responde, notas internas, atribui e fecha); nenhum acesso aos módulos da plataforma; só um super-administrador o pode criar; só vale na organização da plataforma.</w:t>
+      </w:r>
+    </w:p>
+    <w:p>
+      <w:pPr>
+        <w:spacing w:after="80"/>
+        <w:ind w:left="720" w:hanging="360"/>
+        <w:rPr>
+          <w:rFonts w:ascii="Montserrat" w:hAnsi="Montserrat"/>
+          <w:sz w:val="20"/>
+          <w:szCs w:val="20"/>
+        </w:rPr>
+      </w:pPr>
+      <w:r>
+        <w:rPr>
+          <w:rFonts w:ascii="Montserrat" w:hAnsi="Montserrat" w:cs="Segoe UI Emoji"/>
+          <w:sz w:val="20"/>
+          <w:szCs w:val="20"/>
+        </w:rPr>
+        <w:t xml:space="preserve">• </w:t>
+      </w:r>
+      <w:r>
+        <w:rPr>
+          <w:rFonts w:ascii="Montserrat" w:hAnsi="Montserrat" w:cs="Segoe UI Emoji"/>
+          <w:sz w:val="20"/>
+          <w:szCs w:val="20"/>
+        </w:rPr>
+        <w:t xml:space="preserve">Segurança: um SUPER_ADMIN ou SUPPORT criado numa organização de cliente já não vê os tickets de todos os clientes; atribuição só a membros da equipa de suporte; anexos de tickets seguem a visibilidade do ticket (antes qualquer utilizador podia anexar a tickets de outros e a equipa de suporte não conseguia descarregar anexos de clientes).</w:t>
+      </w:r>
+    </w:p>
+    <w:p>
+      <w:pPr>
+        <w:spacing w:after="80"/>
+        <w:ind w:left="720" w:hanging="360"/>
+        <w:rPr>
+          <w:rFonts w:ascii="Montserrat" w:hAnsi="Montserrat"/>
+          <w:sz w:val="20"/>
+          <w:szCs w:val="20"/>
+        </w:rPr>
+      </w:pPr>
+      <w:r>
+        <w:rPr>
+          <w:rFonts w:ascii="Montserrat" w:hAnsi="Montserrat" w:cs="Segoe UI Emoji"/>
+          <w:sz w:val="20"/>
+          <w:szCs w:val="20"/>
+        </w:rPr>
+        <w:t xml:space="preserve">• </w:t>
+      </w:r>
+      <w:r>
+        <w:rPr>
+          <w:rFonts w:ascii="Montserrat" w:hAnsi="Montserrat" w:cs="Segoe UI Emoji"/>
+          <w:sz w:val="20"/>
+          <w:szCs w:val="20"/>
+        </w:rPr>
+        <w:t xml:space="preserve">Base de dados: valor novo SUPPORT no enum de perfis (aditivo). Testes: 13 unitários novos.</w:t>
       </w:r>
     </w:p>
     <w:sectPr>

</xml_diff>

<commit_message>
fix(config): variaveis das integracoes chegam ao servidor; suporte para support@icomply.pt; tickets de teste
- docker-compose (dev, staging, producao): repassam SUPPORT_NOTIFY_EMAIL, LEADS_NOTIFY_EMAIL, CORS_ORIGINS, STRIPE_*, KYC_PROVIDER, DIDIT_*, OPENSANCTIONS_*, STRIPE_IDENTITY_*, SUMSUB_*, TRULIOO_API_KEY (vazias = desativadas); producao com SUPPORT_NOTIFY_EMAIL=support@icomply.pt por omissao. Antes nada disto chegava ao contentor, fosse qual fosse o ficheiro .env do servidor
- CORS: acrescenta https://www.icomply.pt (icomply.pt ja era aceite)
- Suporte: tickets das contas de teste (*@icomply-test.pt) nao enviam emails; staff pode apagar esses tickets (API + botao); nunca tickets de clientes
- Docs: INTEGRATION/BRIEF corrigidos (CORS nada a configurar), pacote do Co-work regenerado, changelog, API, README, Word

Co-Authored-By: Claude Sonnet 5.5 <noreply@anthropic.com>
</commit_message>
<xml_diff>
--- a/2_FUNCIONALIDADES iComply App.docx
+++ b/2_FUNCIONALIDADES iComply App.docx
@@ -44000,6 +44000,119 @@
           <w:szCs w:val="20"/>
         </w:rPr>
         <w:t xml:space="preserve">Ferramentas: script para ligar/desligar as contas de teste automático (scripts/test-accounts.mjs), CI no GitHub (tipos, lint, testes), ESLint 9, testes do backend estáveis (271 → 290, ordem aleatória, sob carga) e sem vulnerabilidades conhecidas nas dependências.</w:t>
+      </w:r>
+    </w:p>
+    <w:p>
+      <w:pPr>
+        <w:spacing w:after="80"/>
+        <w:ind w:left="360"/>
+        <w:rPr>
+          <w:rFonts w:ascii="Montserrat" w:hAnsi="Montserrat"/>
+          <w:sz w:val="20"/>
+          <w:szCs w:val="20"/>
+        </w:rPr>
+      </w:pPr>
+    </w:p>
+    <w:p>
+      <w:pPr>
+        <w:spacing w:after="80"/>
+        <w:ind w:left="360"/>
+        <w:rPr>
+          <w:rFonts w:ascii="Montserrat" w:hAnsi="Montserrat"/>
+          <w:sz w:val="20"/>
+          <w:szCs w:val="20"/>
+        </w:rPr>
+      </w:pPr>
+      <w:r>
+        <w:rPr>
+          <w:rFonts w:ascii="Montserrat" w:hAnsi="Montserrat" w:cs="Segoe UI Emoji"/>
+          <w:b/>
+          <w:bCs/>
+          <w:sz w:val="20"/>
+          <w:szCs w:val="20"/>
+        </w:rPr>
+        <w:t xml:space="preserve">⚙️ Atualização 05/10/2026 — Configuração do servidor e suporte</w:t>
+      </w:r>
+    </w:p>
+    <w:p>
+      <w:pPr>
+        <w:spacing w:after="80"/>
+        <w:ind w:left="720" w:hanging="360"/>
+        <w:rPr>
+          <w:rFonts w:ascii="Montserrat" w:hAnsi="Montserrat"/>
+          <w:sz w:val="20"/>
+          <w:szCs w:val="20"/>
+        </w:rPr>
+      </w:pPr>
+      <w:r>
+        <w:rPr>
+          <w:rFonts w:ascii="Montserrat" w:hAnsi="Montserrat" w:cs="Segoe UI Emoji"/>
+          <w:sz w:val="20"/>
+          <w:szCs w:val="20"/>
+        </w:rPr>
+        <w:t xml:space="preserve">• </w:t>
+      </w:r>
+      <w:r>
+        <w:rPr>
+          <w:rFonts w:ascii="Montserrat" w:hAnsi="Montserrat" w:cs="Segoe UI Emoji"/>
+          <w:sz w:val="20"/>
+          <w:szCs w:val="20"/>
+        </w:rPr>
+        <w:t xml:space="preserve">Correção: as variáveis das integrações (suporte, leads, KYC — Didit, OpenSanctions, Stripe Identity, Sumsub, Trulioo —, Stripe de faturação) não chegavam ao servidor porque os ficheiros docker-compose não as repassavam; passaram a repassar (vazias = desativadas). Em produção, SUPPORT_NOTIFY_EMAIL tem por omissão support@icomply.pt.</w:t>
+      </w:r>
+    </w:p>
+    <w:p>
+      <w:pPr>
+        <w:spacing w:after="80"/>
+        <w:ind w:left="720" w:hanging="360"/>
+        <w:rPr>
+          <w:rFonts w:ascii="Montserrat" w:hAnsi="Montserrat"/>
+          <w:sz w:val="20"/>
+          <w:szCs w:val="20"/>
+        </w:rPr>
+      </w:pPr>
+      <w:r>
+        <w:rPr>
+          <w:rFonts w:ascii="Montserrat" w:hAnsi="Montserrat" w:cs="Segoe UI Emoji"/>
+          <w:sz w:val="20"/>
+          <w:szCs w:val="20"/>
+        </w:rPr>
+        <w:t xml:space="preserve">• </w:t>
+      </w:r>
+      <w:r>
+        <w:rPr>
+          <w:rFonts w:ascii="Montserrat" w:hAnsi="Montserrat" w:cs="Segoe UI Emoji"/>
+          <w:sz w:val="20"/>
+          <w:szCs w:val="20"/>
+        </w:rPr>
+        <w:t xml:space="preserve">CORS: o site icomply.pt (e www.icomply.pt) já são aceites pela API; não é preciso configurar nada para os formulários do site.</w:t>
+      </w:r>
+    </w:p>
+    <w:p>
+      <w:pPr>
+        <w:spacing w:after="80"/>
+        <w:ind w:left="720" w:hanging="360"/>
+        <w:rPr>
+          <w:rFonts w:ascii="Montserrat" w:hAnsi="Montserrat"/>
+          <w:sz w:val="20"/>
+          <w:szCs w:val="20"/>
+        </w:rPr>
+      </w:pPr>
+      <w:r>
+        <w:rPr>
+          <w:rFonts w:ascii="Montserrat" w:hAnsi="Montserrat" w:cs="Segoe UI Emoji"/>
+          <w:sz w:val="20"/>
+          <w:szCs w:val="20"/>
+        </w:rPr>
+        <w:t xml:space="preserve">• </w:t>
+      </w:r>
+      <w:r>
+        <w:rPr>
+          <w:rFonts w:ascii="Montserrat" w:hAnsi="Montserrat" w:cs="Segoe UI Emoji"/>
+          <w:sz w:val="20"/>
+          <w:szCs w:val="20"/>
+        </w:rPr>
+        <w:t xml:space="preserve">Tickets abertos pelas contas de teste automático (*@icomply-test.pt) já não enviam emails à equipa e podem ser apagados no ecrã de suporte (apenas esses; nunca tickets de clientes).</w:t>
       </w:r>
     </w:p>
     <w:sectPr>

</xml_diff>